<commit_message>
Update A2 submission files and .DS_Store
Replace A2_SQL_GUANCHENG RONG_1856981.docx and .pdf with updated versions and update macOS .DS_Store metadata files. Updates affect files under 90002/a2 (submission materials).
</commit_message>
<xml_diff>
--- a/90002/a2/A2_SQL_GUANCHENG RONG_1856981.docx
+++ b/90002/a2/A2_SQL_GUANCHENG RONG_1856981.docx
@@ -30,15 +30,23 @@
       <w:pPr>
         <w:rPr>
           <w:rFonts w:eastAsia="宋体"/>
+          <w:sz w:val="22"/>
+          <w:szCs w:val="32"/>
           <w:lang w:eastAsia="zh-CN"/>
         </w:rPr>
       </w:pPr>
       <w:r>
+        <w:rPr>
+          <w:sz w:val="22"/>
+          <w:szCs w:val="32"/>
+        </w:rPr>
         <w:t xml:space="preserve">Student Name: </w:t>
       </w:r>
       <w:r>
         <w:rPr>
           <w:rFonts w:eastAsia="宋体" w:hint="eastAsia"/>
+          <w:sz w:val="22"/>
+          <w:szCs w:val="32"/>
           <w:lang w:eastAsia="zh-CN"/>
         </w:rPr>
         <w:t>GUANCHENG</w:t>
@@ -46,29 +54,243 @@
       <w:r>
         <w:rPr>
           <w:rFonts w:eastAsia="宋体"/>
+          <w:sz w:val="22"/>
+          <w:szCs w:val="32"/>
           <w:lang w:eastAsia="zh-CN"/>
         </w:rPr>
         <w:t xml:space="preserve"> RONG</w:t>
       </w:r>
     </w:p>
     <w:p>
-      <w:r>
+      <w:pPr>
+        <w:rPr>
+          <w:sz w:val="22"/>
+          <w:szCs w:val="32"/>
+        </w:rPr>
+      </w:pPr>
+      <w:r>
+        <w:rPr>
+          <w:sz w:val="22"/>
+          <w:szCs w:val="32"/>
+        </w:rPr>
         <w:t>Student ID: 1856981</w:t>
       </w:r>
     </w:p>
     <w:p>
-      <w:r>
+      <w:pPr>
+        <w:rPr>
+          <w:sz w:val="22"/>
+          <w:szCs w:val="32"/>
+        </w:rPr>
+      </w:pPr>
+      <w:r>
+        <w:rPr>
+          <w:sz w:val="22"/>
+          <w:szCs w:val="32"/>
+        </w:rPr>
         <w:t>Table suffix used: 6981</w:t>
       </w:r>
     </w:p>
     <w:p>
-      <w:r>
+      <w:pPr>
+        <w:rPr>
+          <w:sz w:val="22"/>
+          <w:szCs w:val="32"/>
+        </w:rPr>
+      </w:pPr>
+      <w:r>
+        <w:rPr>
+          <w:sz w:val="22"/>
+          <w:szCs w:val="32"/>
+        </w:rPr>
         <w:t>Note: SQL statements use the ENG script table names with suffix 6981.</w:t>
       </w:r>
     </w:p>
     <w:p/>
     <w:p/>
-    <w:p/>
+    <w:p>
+      <w:pPr>
+        <w:rPr>
+          <w:lang w:eastAsia="zh-CN"/>
+        </w:rPr>
+      </w:pPr>
+    </w:p>
+    <w:p>
+      <w:pPr>
+        <w:rPr>
+          <w:lang w:eastAsia="zh-CN"/>
+        </w:rPr>
+      </w:pPr>
+    </w:p>
+    <w:p>
+      <w:pPr>
+        <w:rPr>
+          <w:lang w:eastAsia="zh-CN"/>
+        </w:rPr>
+      </w:pPr>
+    </w:p>
+    <w:p>
+      <w:pPr>
+        <w:rPr>
+          <w:lang w:eastAsia="zh-CN"/>
+        </w:rPr>
+      </w:pPr>
+    </w:p>
+    <w:p>
+      <w:pPr>
+        <w:rPr>
+          <w:lang w:eastAsia="zh-CN"/>
+        </w:rPr>
+      </w:pPr>
+    </w:p>
+    <w:p>
+      <w:pPr>
+        <w:rPr>
+          <w:lang w:eastAsia="zh-CN"/>
+        </w:rPr>
+      </w:pPr>
+    </w:p>
+    <w:p>
+      <w:pPr>
+        <w:rPr>
+          <w:lang w:eastAsia="zh-CN"/>
+        </w:rPr>
+      </w:pPr>
+    </w:p>
+    <w:p>
+      <w:pPr>
+        <w:rPr>
+          <w:lang w:eastAsia="zh-CN"/>
+        </w:rPr>
+      </w:pPr>
+    </w:p>
+    <w:p>
+      <w:pPr>
+        <w:rPr>
+          <w:lang w:eastAsia="zh-CN"/>
+        </w:rPr>
+      </w:pPr>
+    </w:p>
+    <w:p>
+      <w:pPr>
+        <w:rPr>
+          <w:lang w:eastAsia="zh-CN"/>
+        </w:rPr>
+      </w:pPr>
+    </w:p>
+    <w:p>
+      <w:pPr>
+        <w:rPr>
+          <w:lang w:eastAsia="zh-CN"/>
+        </w:rPr>
+      </w:pPr>
+    </w:p>
+    <w:p>
+      <w:pPr>
+        <w:rPr>
+          <w:lang w:eastAsia="zh-CN"/>
+        </w:rPr>
+      </w:pPr>
+    </w:p>
+    <w:p>
+      <w:pPr>
+        <w:rPr>
+          <w:lang w:eastAsia="zh-CN"/>
+        </w:rPr>
+      </w:pPr>
+    </w:p>
+    <w:p>
+      <w:pPr>
+        <w:rPr>
+          <w:lang w:eastAsia="zh-CN"/>
+        </w:rPr>
+      </w:pPr>
+    </w:p>
+    <w:p>
+      <w:pPr>
+        <w:rPr>
+          <w:lang w:eastAsia="zh-CN"/>
+        </w:rPr>
+      </w:pPr>
+    </w:p>
+    <w:p>
+      <w:pPr>
+        <w:rPr>
+          <w:lang w:eastAsia="zh-CN"/>
+        </w:rPr>
+      </w:pPr>
+    </w:p>
+    <w:p>
+      <w:pPr>
+        <w:rPr>
+          <w:lang w:eastAsia="zh-CN"/>
+        </w:rPr>
+      </w:pPr>
+    </w:p>
+    <w:p>
+      <w:pPr>
+        <w:rPr>
+          <w:lang w:eastAsia="zh-CN"/>
+        </w:rPr>
+      </w:pPr>
+    </w:p>
+    <w:p>
+      <w:pPr>
+        <w:rPr>
+          <w:lang w:eastAsia="zh-CN"/>
+        </w:rPr>
+      </w:pPr>
+    </w:p>
+    <w:p>
+      <w:pPr>
+        <w:rPr>
+          <w:lang w:eastAsia="zh-CN"/>
+        </w:rPr>
+      </w:pPr>
+    </w:p>
+    <w:p>
+      <w:pPr>
+        <w:rPr>
+          <w:lang w:eastAsia="zh-CN"/>
+        </w:rPr>
+      </w:pPr>
+    </w:p>
+    <w:p>
+      <w:pPr>
+        <w:rPr>
+          <w:lang w:eastAsia="zh-CN"/>
+        </w:rPr>
+      </w:pPr>
+    </w:p>
+    <w:p>
+      <w:pPr>
+        <w:rPr>
+          <w:lang w:eastAsia="zh-CN"/>
+        </w:rPr>
+      </w:pPr>
+    </w:p>
+    <w:p>
+      <w:pPr>
+        <w:rPr>
+          <w:lang w:eastAsia="zh-CN"/>
+        </w:rPr>
+      </w:pPr>
+    </w:p>
+    <w:p>
+      <w:pPr>
+        <w:rPr>
+          <w:lang w:eastAsia="zh-CN"/>
+        </w:rPr>
+      </w:pPr>
+    </w:p>
+    <w:p>
+      <w:pPr>
+        <w:rPr>
+          <w:rFonts w:hint="eastAsia"/>
+          <w:lang w:eastAsia="zh-CN"/>
+        </w:rPr>
+      </w:pPr>
+    </w:p>
     <w:p>
       <w:r>
         <w:rPr>
@@ -76,6 +298,7 @@
           <w:color w:val="000000"/>
           <w:sz w:val="20"/>
         </w:rPr>
+        <w:lastRenderedPageBreak/>
         <w:t>Q1. List all types of rooms each department has. Your list should show department ID and name and room type ordered alphabetically by department name.</w:t>
       </w:r>
     </w:p>
@@ -1086,29 +1309,180 @@
       </w:r>
     </w:p>
     <w:p>
-      <w:r>
+      <w:pPr>
         <w:rPr>
           <w:b/>
           <w:color w:val="000000"/>
           <w:sz w:val="20"/>
-        </w:rPr>
-        <w:t xml:space="preserve">Q3. List doctors who had appointments in January of the last year. Results should show doctor full name, appointment date, patient's last name and patient ID, ordered by </w:t>
-      </w:r>
-      <w:proofErr w:type="gramStart"/>
-      <w:r>
+          <w:lang w:eastAsia="zh-CN"/>
+        </w:rPr>
+      </w:pPr>
+    </w:p>
+    <w:p>
+      <w:pPr>
         <w:rPr>
           <w:b/>
           <w:color w:val="000000"/>
           <w:sz w:val="20"/>
-        </w:rPr>
-        <w:t>doctor</w:t>
-      </w:r>
-      <w:proofErr w:type="gramEnd"/>
-      <w:r>
+          <w:lang w:eastAsia="zh-CN"/>
+        </w:rPr>
+      </w:pPr>
+    </w:p>
+    <w:p>
+      <w:pPr>
         <w:rPr>
           <w:b/>
           <w:color w:val="000000"/>
           <w:sz w:val="20"/>
+          <w:lang w:eastAsia="zh-CN"/>
+        </w:rPr>
+      </w:pPr>
+    </w:p>
+    <w:p>
+      <w:pPr>
+        <w:rPr>
+          <w:b/>
+          <w:color w:val="000000"/>
+          <w:sz w:val="20"/>
+          <w:lang w:eastAsia="zh-CN"/>
+        </w:rPr>
+      </w:pPr>
+    </w:p>
+    <w:p>
+      <w:pPr>
+        <w:rPr>
+          <w:b/>
+          <w:color w:val="000000"/>
+          <w:sz w:val="20"/>
+          <w:lang w:eastAsia="zh-CN"/>
+        </w:rPr>
+      </w:pPr>
+    </w:p>
+    <w:p>
+      <w:pPr>
+        <w:rPr>
+          <w:b/>
+          <w:color w:val="000000"/>
+          <w:sz w:val="20"/>
+          <w:lang w:eastAsia="zh-CN"/>
+        </w:rPr>
+      </w:pPr>
+    </w:p>
+    <w:p>
+      <w:pPr>
+        <w:rPr>
+          <w:b/>
+          <w:color w:val="000000"/>
+          <w:sz w:val="20"/>
+          <w:lang w:eastAsia="zh-CN"/>
+        </w:rPr>
+      </w:pPr>
+    </w:p>
+    <w:p>
+      <w:pPr>
+        <w:rPr>
+          <w:b/>
+          <w:color w:val="000000"/>
+          <w:sz w:val="20"/>
+          <w:lang w:eastAsia="zh-CN"/>
+        </w:rPr>
+      </w:pPr>
+    </w:p>
+    <w:p>
+      <w:pPr>
+        <w:rPr>
+          <w:b/>
+          <w:color w:val="000000"/>
+          <w:sz w:val="20"/>
+          <w:lang w:eastAsia="zh-CN"/>
+        </w:rPr>
+      </w:pPr>
+    </w:p>
+    <w:p>
+      <w:pPr>
+        <w:rPr>
+          <w:b/>
+          <w:color w:val="000000"/>
+          <w:sz w:val="20"/>
+          <w:lang w:eastAsia="zh-CN"/>
+        </w:rPr>
+      </w:pPr>
+    </w:p>
+    <w:p>
+      <w:pPr>
+        <w:rPr>
+          <w:b/>
+          <w:color w:val="000000"/>
+          <w:sz w:val="20"/>
+          <w:lang w:eastAsia="zh-CN"/>
+        </w:rPr>
+      </w:pPr>
+    </w:p>
+    <w:p>
+      <w:pPr>
+        <w:rPr>
+          <w:b/>
+          <w:color w:val="000000"/>
+          <w:sz w:val="20"/>
+          <w:lang w:eastAsia="zh-CN"/>
+        </w:rPr>
+      </w:pPr>
+    </w:p>
+    <w:p>
+      <w:pPr>
+        <w:rPr>
+          <w:b/>
+          <w:color w:val="000000"/>
+          <w:sz w:val="20"/>
+          <w:lang w:eastAsia="zh-CN"/>
+        </w:rPr>
+      </w:pPr>
+    </w:p>
+    <w:p>
+      <w:pPr>
+        <w:rPr>
+          <w:b/>
+          <w:color w:val="000000"/>
+          <w:sz w:val="20"/>
+          <w:lang w:eastAsia="zh-CN"/>
+        </w:rPr>
+      </w:pPr>
+    </w:p>
+    <w:p>
+      <w:pPr>
+        <w:rPr>
+          <w:b/>
+          <w:color w:val="000000"/>
+          <w:sz w:val="20"/>
+          <w:lang w:eastAsia="zh-CN"/>
+        </w:rPr>
+      </w:pPr>
+    </w:p>
+    <w:p>
+      <w:r>
+        <w:rPr>
+          <w:b/>
+          <w:color w:val="000000"/>
+          <w:sz w:val="20"/>
+        </w:rPr>
+        <w:lastRenderedPageBreak/>
+        <w:t xml:space="preserve">Q3. List doctors who had appointments in January of the last year. Results should show doctor full name, appointment date, patient's last name and patient ID, ordered by </w:t>
+      </w:r>
+      <w:proofErr w:type="gramStart"/>
+      <w:r>
+        <w:rPr>
+          <w:b/>
+          <w:color w:val="000000"/>
+          <w:sz w:val="20"/>
+        </w:rPr>
+        <w:t>doctor</w:t>
+      </w:r>
+      <w:proofErr w:type="gramEnd"/>
+      <w:r>
+        <w:rPr>
+          <w:b/>
+          <w:color w:val="000000"/>
+          <w:sz w:val="20"/>
         </w:rPr>
         <w:t xml:space="preserve"> ID and appointment date.</w:t>
       </w:r>
@@ -1760,8 +2134,8 @@
           <w:noProof/>
         </w:rPr>
         <w:drawing>
-          <wp:inline distT="0" distB="0" distL="114300" distR="114300" wp14:anchorId="791855F2" wp14:editId="6F9078C7">
-            <wp:extent cx="3742125" cy="1327615"/>
+          <wp:inline distT="0" distB="0" distL="114300" distR="114300" wp14:anchorId="791855F2" wp14:editId="060E3979">
+            <wp:extent cx="6498347" cy="2305455"/>
             <wp:effectExtent l="0" t="0" r="4445" b="6350"/>
             <wp:docPr id="3" name="Picture 3"/>
             <wp:cNvGraphicFramePr>
@@ -1785,7 +2159,7 @@
                   <pic:spPr>
                     <a:xfrm>
                       <a:off x="0" y="0"/>
-                      <a:ext cx="3790852" cy="1344902"/>
+                      <a:ext cx="6643622" cy="2356995"/>
                     </a:xfrm>
                     <a:prstGeom prst="rect">
                       <a:avLst/>
@@ -1808,11 +2182,162 @@
       </w:r>
     </w:p>
     <w:p>
-      <w:r>
+      <w:pPr>
         <w:rPr>
           <w:b/>
           <w:color w:val="000000"/>
           <w:sz w:val="20"/>
+          <w:lang w:eastAsia="zh-CN"/>
+        </w:rPr>
+      </w:pPr>
+    </w:p>
+    <w:p>
+      <w:pPr>
+        <w:rPr>
+          <w:b/>
+          <w:color w:val="000000"/>
+          <w:sz w:val="20"/>
+          <w:lang w:eastAsia="zh-CN"/>
+        </w:rPr>
+      </w:pPr>
+    </w:p>
+    <w:p>
+      <w:pPr>
+        <w:rPr>
+          <w:b/>
+          <w:color w:val="000000"/>
+          <w:sz w:val="20"/>
+          <w:lang w:eastAsia="zh-CN"/>
+        </w:rPr>
+      </w:pPr>
+    </w:p>
+    <w:p>
+      <w:pPr>
+        <w:rPr>
+          <w:b/>
+          <w:color w:val="000000"/>
+          <w:sz w:val="20"/>
+          <w:lang w:eastAsia="zh-CN"/>
+        </w:rPr>
+      </w:pPr>
+    </w:p>
+    <w:p>
+      <w:pPr>
+        <w:rPr>
+          <w:b/>
+          <w:color w:val="000000"/>
+          <w:sz w:val="20"/>
+          <w:lang w:eastAsia="zh-CN"/>
+        </w:rPr>
+      </w:pPr>
+    </w:p>
+    <w:p>
+      <w:pPr>
+        <w:rPr>
+          <w:b/>
+          <w:color w:val="000000"/>
+          <w:sz w:val="20"/>
+          <w:lang w:eastAsia="zh-CN"/>
+        </w:rPr>
+      </w:pPr>
+    </w:p>
+    <w:p>
+      <w:pPr>
+        <w:rPr>
+          <w:b/>
+          <w:color w:val="000000"/>
+          <w:sz w:val="20"/>
+          <w:lang w:eastAsia="zh-CN"/>
+        </w:rPr>
+      </w:pPr>
+    </w:p>
+    <w:p>
+      <w:pPr>
+        <w:rPr>
+          <w:b/>
+          <w:color w:val="000000"/>
+          <w:sz w:val="20"/>
+          <w:lang w:eastAsia="zh-CN"/>
+        </w:rPr>
+      </w:pPr>
+    </w:p>
+    <w:p>
+      <w:pPr>
+        <w:rPr>
+          <w:b/>
+          <w:color w:val="000000"/>
+          <w:sz w:val="20"/>
+          <w:lang w:eastAsia="zh-CN"/>
+        </w:rPr>
+      </w:pPr>
+    </w:p>
+    <w:p>
+      <w:pPr>
+        <w:rPr>
+          <w:b/>
+          <w:color w:val="000000"/>
+          <w:sz w:val="20"/>
+          <w:lang w:eastAsia="zh-CN"/>
+        </w:rPr>
+      </w:pPr>
+    </w:p>
+    <w:p>
+      <w:pPr>
+        <w:rPr>
+          <w:b/>
+          <w:color w:val="000000"/>
+          <w:sz w:val="20"/>
+          <w:lang w:eastAsia="zh-CN"/>
+        </w:rPr>
+      </w:pPr>
+    </w:p>
+    <w:p>
+      <w:pPr>
+        <w:rPr>
+          <w:b/>
+          <w:color w:val="000000"/>
+          <w:sz w:val="20"/>
+          <w:lang w:eastAsia="zh-CN"/>
+        </w:rPr>
+      </w:pPr>
+    </w:p>
+    <w:p>
+      <w:pPr>
+        <w:rPr>
+          <w:b/>
+          <w:color w:val="000000"/>
+          <w:sz w:val="20"/>
+          <w:lang w:eastAsia="zh-CN"/>
+        </w:rPr>
+      </w:pPr>
+    </w:p>
+    <w:p>
+      <w:pPr>
+        <w:rPr>
+          <w:b/>
+          <w:color w:val="000000"/>
+          <w:sz w:val="20"/>
+          <w:lang w:eastAsia="zh-CN"/>
+        </w:rPr>
+      </w:pPr>
+    </w:p>
+    <w:p>
+      <w:pPr>
+        <w:rPr>
+          <w:rFonts w:hint="eastAsia"/>
+          <w:b/>
+          <w:color w:val="000000"/>
+          <w:sz w:val="20"/>
+          <w:lang w:eastAsia="zh-CN"/>
+        </w:rPr>
+      </w:pPr>
+    </w:p>
+    <w:p>
+      <w:r>
+        <w:rPr>
+          <w:b/>
+          <w:color w:val="000000"/>
+          <w:sz w:val="20"/>
         </w:rPr>
         <w:lastRenderedPageBreak/>
         <w:t>Q4. List doctors with most expensive appointments. Results should show doctor's name as last name, comma, first name, appointment date, patient name as first name then last name, and payment amount.</w:t>
@@ -2379,9 +2904,9 @@
           <w:noProof/>
         </w:rPr>
         <w:drawing>
-          <wp:inline distT="0" distB="0" distL="114300" distR="114300" wp14:anchorId="41CB22FE" wp14:editId="2C8D0673">
-            <wp:extent cx="4364531" cy="447644"/>
-            <wp:effectExtent l="0" t="0" r="0" b="0"/>
+          <wp:inline distT="0" distB="0" distL="114300" distR="114300" wp14:anchorId="41CB22FE" wp14:editId="5E846177">
+            <wp:extent cx="6070055" cy="622570"/>
+            <wp:effectExtent l="0" t="0" r="635" b="0"/>
             <wp:docPr id="4" name="Picture 4"/>
             <wp:cNvGraphicFramePr>
               <a:graphicFrameLocks xmlns:a="http://schemas.openxmlformats.org/drawingml/2006/main" noChangeAspect="1"/>
@@ -2404,7 +2929,7 @@
                   <pic:spPr>
                     <a:xfrm>
                       <a:off x="0" y="0"/>
-                      <a:ext cx="4433303" cy="454698"/>
+                      <a:ext cx="6528143" cy="669553"/>
                     </a:xfrm>
                     <a:prstGeom prst="rect">
                       <a:avLst/>
@@ -2428,12 +2953,214 @@
     </w:p>
     <w:p/>
     <w:p>
-      <w:r>
+      <w:pPr>
         <w:rPr>
           <w:b/>
           <w:color w:val="000000"/>
           <w:sz w:val="20"/>
-        </w:rPr>
+          <w:lang w:eastAsia="zh-CN"/>
+        </w:rPr>
+      </w:pPr>
+    </w:p>
+    <w:p>
+      <w:pPr>
+        <w:rPr>
+          <w:b/>
+          <w:color w:val="000000"/>
+          <w:sz w:val="20"/>
+          <w:lang w:eastAsia="zh-CN"/>
+        </w:rPr>
+      </w:pPr>
+    </w:p>
+    <w:p>
+      <w:pPr>
+        <w:rPr>
+          <w:b/>
+          <w:color w:val="000000"/>
+          <w:sz w:val="20"/>
+          <w:lang w:eastAsia="zh-CN"/>
+        </w:rPr>
+      </w:pPr>
+    </w:p>
+    <w:p>
+      <w:pPr>
+        <w:rPr>
+          <w:b/>
+          <w:color w:val="000000"/>
+          <w:sz w:val="20"/>
+          <w:lang w:eastAsia="zh-CN"/>
+        </w:rPr>
+      </w:pPr>
+    </w:p>
+    <w:p>
+      <w:pPr>
+        <w:rPr>
+          <w:b/>
+          <w:color w:val="000000"/>
+          <w:sz w:val="20"/>
+          <w:lang w:eastAsia="zh-CN"/>
+        </w:rPr>
+      </w:pPr>
+    </w:p>
+    <w:p>
+      <w:pPr>
+        <w:rPr>
+          <w:b/>
+          <w:color w:val="000000"/>
+          <w:sz w:val="20"/>
+          <w:lang w:eastAsia="zh-CN"/>
+        </w:rPr>
+      </w:pPr>
+    </w:p>
+    <w:p>
+      <w:pPr>
+        <w:rPr>
+          <w:b/>
+          <w:color w:val="000000"/>
+          <w:sz w:val="20"/>
+          <w:lang w:eastAsia="zh-CN"/>
+        </w:rPr>
+      </w:pPr>
+    </w:p>
+    <w:p>
+      <w:pPr>
+        <w:rPr>
+          <w:b/>
+          <w:color w:val="000000"/>
+          <w:sz w:val="20"/>
+          <w:lang w:eastAsia="zh-CN"/>
+        </w:rPr>
+      </w:pPr>
+    </w:p>
+    <w:p>
+      <w:pPr>
+        <w:rPr>
+          <w:b/>
+          <w:color w:val="000000"/>
+          <w:sz w:val="20"/>
+          <w:lang w:eastAsia="zh-CN"/>
+        </w:rPr>
+      </w:pPr>
+    </w:p>
+    <w:p>
+      <w:pPr>
+        <w:rPr>
+          <w:b/>
+          <w:color w:val="000000"/>
+          <w:sz w:val="20"/>
+          <w:lang w:eastAsia="zh-CN"/>
+        </w:rPr>
+      </w:pPr>
+    </w:p>
+    <w:p>
+      <w:pPr>
+        <w:rPr>
+          <w:b/>
+          <w:color w:val="000000"/>
+          <w:sz w:val="20"/>
+          <w:lang w:eastAsia="zh-CN"/>
+        </w:rPr>
+      </w:pPr>
+    </w:p>
+    <w:p>
+      <w:pPr>
+        <w:rPr>
+          <w:b/>
+          <w:color w:val="000000"/>
+          <w:sz w:val="20"/>
+          <w:lang w:eastAsia="zh-CN"/>
+        </w:rPr>
+      </w:pPr>
+    </w:p>
+    <w:p>
+      <w:pPr>
+        <w:rPr>
+          <w:b/>
+          <w:color w:val="000000"/>
+          <w:sz w:val="20"/>
+          <w:lang w:eastAsia="zh-CN"/>
+        </w:rPr>
+      </w:pPr>
+    </w:p>
+    <w:p>
+      <w:pPr>
+        <w:rPr>
+          <w:b/>
+          <w:color w:val="000000"/>
+          <w:sz w:val="20"/>
+          <w:lang w:eastAsia="zh-CN"/>
+        </w:rPr>
+      </w:pPr>
+    </w:p>
+    <w:p>
+      <w:pPr>
+        <w:rPr>
+          <w:b/>
+          <w:color w:val="000000"/>
+          <w:sz w:val="20"/>
+          <w:lang w:eastAsia="zh-CN"/>
+        </w:rPr>
+      </w:pPr>
+    </w:p>
+    <w:p>
+      <w:pPr>
+        <w:rPr>
+          <w:b/>
+          <w:color w:val="000000"/>
+          <w:sz w:val="20"/>
+          <w:lang w:eastAsia="zh-CN"/>
+        </w:rPr>
+      </w:pPr>
+    </w:p>
+    <w:p>
+      <w:pPr>
+        <w:rPr>
+          <w:b/>
+          <w:color w:val="000000"/>
+          <w:sz w:val="20"/>
+          <w:lang w:eastAsia="zh-CN"/>
+        </w:rPr>
+      </w:pPr>
+    </w:p>
+    <w:p>
+      <w:pPr>
+        <w:rPr>
+          <w:b/>
+          <w:color w:val="000000"/>
+          <w:sz w:val="20"/>
+          <w:lang w:eastAsia="zh-CN"/>
+        </w:rPr>
+      </w:pPr>
+    </w:p>
+    <w:p>
+      <w:pPr>
+        <w:rPr>
+          <w:b/>
+          <w:color w:val="000000"/>
+          <w:sz w:val="20"/>
+          <w:lang w:eastAsia="zh-CN"/>
+        </w:rPr>
+      </w:pPr>
+    </w:p>
+    <w:p>
+      <w:pPr>
+        <w:rPr>
+          <w:rFonts w:hint="eastAsia"/>
+          <w:b/>
+          <w:color w:val="000000"/>
+          <w:sz w:val="20"/>
+          <w:lang w:eastAsia="zh-CN"/>
+        </w:rPr>
+      </w:pPr>
+    </w:p>
+    <w:p>
+      <w:r>
+        <w:rPr>
+          <w:b/>
+          <w:color w:val="000000"/>
+          <w:sz w:val="20"/>
+        </w:rPr>
+        <w:lastRenderedPageBreak/>
         <w:t>Q5. List all wards that currently have no beds. Results should show ward number and ward name sorted in alphabetical order of ward names.</w:t>
       </w:r>
     </w:p>
@@ -2784,9 +3511,9 @@
           <w:noProof/>
         </w:rPr>
         <w:drawing>
-          <wp:inline distT="0" distB="0" distL="114300" distR="114300" wp14:anchorId="0ADDF2F6" wp14:editId="44E889BF">
-            <wp:extent cx="2904565" cy="497090"/>
-            <wp:effectExtent l="0" t="0" r="0" b="0"/>
+          <wp:inline distT="0" distB="0" distL="114300" distR="114300" wp14:anchorId="0ADDF2F6" wp14:editId="5158FF26">
+            <wp:extent cx="5627164" cy="963038"/>
+            <wp:effectExtent l="0" t="0" r="0" b="2540"/>
             <wp:docPr id="5" name="Picture 5"/>
             <wp:cNvGraphicFramePr>
               <a:graphicFrameLocks xmlns:a="http://schemas.openxmlformats.org/drawingml/2006/main" noChangeAspect="1"/>
@@ -2809,7 +3536,7 @@
                   <pic:spPr>
                     <a:xfrm>
                       <a:off x="0" y="0"/>
-                      <a:ext cx="3083880" cy="527778"/>
+                      <a:ext cx="6051057" cy="1035583"/>
                     </a:xfrm>
                     <a:prstGeom prst="rect">
                       <a:avLst/>
@@ -2832,12 +3559,234 @@
       </w:r>
     </w:p>
     <w:p>
-      <w:r>
+      <w:pPr>
         <w:rPr>
           <w:b/>
           <w:color w:val="000000"/>
           <w:sz w:val="20"/>
-        </w:rPr>
+          <w:lang w:eastAsia="zh-CN"/>
+        </w:rPr>
+      </w:pPr>
+    </w:p>
+    <w:p>
+      <w:pPr>
+        <w:rPr>
+          <w:b/>
+          <w:color w:val="000000"/>
+          <w:sz w:val="20"/>
+          <w:lang w:eastAsia="zh-CN"/>
+        </w:rPr>
+      </w:pPr>
+    </w:p>
+    <w:p>
+      <w:pPr>
+        <w:rPr>
+          <w:b/>
+          <w:color w:val="000000"/>
+          <w:sz w:val="20"/>
+          <w:lang w:eastAsia="zh-CN"/>
+        </w:rPr>
+      </w:pPr>
+    </w:p>
+    <w:p>
+      <w:pPr>
+        <w:rPr>
+          <w:b/>
+          <w:color w:val="000000"/>
+          <w:sz w:val="20"/>
+          <w:lang w:eastAsia="zh-CN"/>
+        </w:rPr>
+      </w:pPr>
+    </w:p>
+    <w:p>
+      <w:pPr>
+        <w:rPr>
+          <w:b/>
+          <w:color w:val="000000"/>
+          <w:sz w:val="20"/>
+          <w:lang w:eastAsia="zh-CN"/>
+        </w:rPr>
+      </w:pPr>
+    </w:p>
+    <w:p>
+      <w:pPr>
+        <w:rPr>
+          <w:b/>
+          <w:color w:val="000000"/>
+          <w:sz w:val="20"/>
+          <w:lang w:eastAsia="zh-CN"/>
+        </w:rPr>
+      </w:pPr>
+    </w:p>
+    <w:p>
+      <w:pPr>
+        <w:rPr>
+          <w:b/>
+          <w:color w:val="000000"/>
+          <w:sz w:val="20"/>
+          <w:lang w:eastAsia="zh-CN"/>
+        </w:rPr>
+      </w:pPr>
+    </w:p>
+    <w:p>
+      <w:pPr>
+        <w:rPr>
+          <w:b/>
+          <w:color w:val="000000"/>
+          <w:sz w:val="20"/>
+          <w:lang w:eastAsia="zh-CN"/>
+        </w:rPr>
+      </w:pPr>
+    </w:p>
+    <w:p>
+      <w:pPr>
+        <w:rPr>
+          <w:b/>
+          <w:color w:val="000000"/>
+          <w:sz w:val="20"/>
+          <w:lang w:eastAsia="zh-CN"/>
+        </w:rPr>
+      </w:pPr>
+    </w:p>
+    <w:p>
+      <w:pPr>
+        <w:rPr>
+          <w:b/>
+          <w:color w:val="000000"/>
+          <w:sz w:val="20"/>
+          <w:lang w:eastAsia="zh-CN"/>
+        </w:rPr>
+      </w:pPr>
+    </w:p>
+    <w:p>
+      <w:pPr>
+        <w:rPr>
+          <w:b/>
+          <w:color w:val="000000"/>
+          <w:sz w:val="20"/>
+          <w:lang w:eastAsia="zh-CN"/>
+        </w:rPr>
+      </w:pPr>
+    </w:p>
+    <w:p>
+      <w:pPr>
+        <w:rPr>
+          <w:b/>
+          <w:color w:val="000000"/>
+          <w:sz w:val="20"/>
+          <w:lang w:eastAsia="zh-CN"/>
+        </w:rPr>
+      </w:pPr>
+    </w:p>
+    <w:p>
+      <w:pPr>
+        <w:rPr>
+          <w:b/>
+          <w:color w:val="000000"/>
+          <w:sz w:val="20"/>
+          <w:lang w:eastAsia="zh-CN"/>
+        </w:rPr>
+      </w:pPr>
+    </w:p>
+    <w:p>
+      <w:pPr>
+        <w:rPr>
+          <w:b/>
+          <w:color w:val="000000"/>
+          <w:sz w:val="20"/>
+          <w:lang w:eastAsia="zh-CN"/>
+        </w:rPr>
+      </w:pPr>
+    </w:p>
+    <w:p>
+      <w:pPr>
+        <w:rPr>
+          <w:b/>
+          <w:color w:val="000000"/>
+          <w:sz w:val="20"/>
+          <w:lang w:eastAsia="zh-CN"/>
+        </w:rPr>
+      </w:pPr>
+    </w:p>
+    <w:p>
+      <w:pPr>
+        <w:rPr>
+          <w:b/>
+          <w:color w:val="000000"/>
+          <w:sz w:val="20"/>
+          <w:lang w:eastAsia="zh-CN"/>
+        </w:rPr>
+      </w:pPr>
+    </w:p>
+    <w:p>
+      <w:pPr>
+        <w:rPr>
+          <w:b/>
+          <w:color w:val="000000"/>
+          <w:sz w:val="20"/>
+          <w:lang w:eastAsia="zh-CN"/>
+        </w:rPr>
+      </w:pPr>
+    </w:p>
+    <w:p>
+      <w:pPr>
+        <w:rPr>
+          <w:b/>
+          <w:color w:val="000000"/>
+          <w:sz w:val="20"/>
+          <w:lang w:eastAsia="zh-CN"/>
+        </w:rPr>
+      </w:pPr>
+    </w:p>
+    <w:p>
+      <w:pPr>
+        <w:rPr>
+          <w:b/>
+          <w:color w:val="000000"/>
+          <w:sz w:val="20"/>
+          <w:lang w:eastAsia="zh-CN"/>
+        </w:rPr>
+      </w:pPr>
+    </w:p>
+    <w:p>
+      <w:pPr>
+        <w:rPr>
+          <w:b/>
+          <w:color w:val="000000"/>
+          <w:sz w:val="20"/>
+          <w:lang w:eastAsia="zh-CN"/>
+        </w:rPr>
+      </w:pPr>
+    </w:p>
+    <w:p>
+      <w:pPr>
+        <w:rPr>
+          <w:b/>
+          <w:color w:val="000000"/>
+          <w:sz w:val="20"/>
+          <w:lang w:eastAsia="zh-CN"/>
+        </w:rPr>
+      </w:pPr>
+    </w:p>
+    <w:p>
+      <w:pPr>
+        <w:rPr>
+          <w:rFonts w:hint="eastAsia"/>
+          <w:b/>
+          <w:color w:val="000000"/>
+          <w:sz w:val="20"/>
+          <w:lang w:eastAsia="zh-CN"/>
+        </w:rPr>
+      </w:pPr>
+    </w:p>
+    <w:p>
+      <w:r>
+        <w:rPr>
+          <w:b/>
+          <w:color w:val="000000"/>
+          <w:sz w:val="20"/>
+        </w:rPr>
+        <w:lastRenderedPageBreak/>
         <w:t>Q6. List how many rooms have never been used within each department, not including consultation rooms. For each department with unused rooms, show department ID, department name and number of unused rooms in descending order of room count.</w:t>
       </w:r>
     </w:p>
@@ -3358,11 +4307,10 @@
         <w:rPr>
           <w:noProof/>
         </w:rPr>
-        <w:lastRenderedPageBreak/>
         <w:drawing>
-          <wp:inline distT="0" distB="0" distL="114300" distR="114300" wp14:anchorId="476D79CF" wp14:editId="4897952E">
-            <wp:extent cx="3473183" cy="1387756"/>
-            <wp:effectExtent l="0" t="0" r="0" b="0"/>
+          <wp:inline distT="0" distB="0" distL="114300" distR="114300" wp14:anchorId="476D79CF" wp14:editId="73DE1263">
+            <wp:extent cx="5916015" cy="2363822"/>
+            <wp:effectExtent l="0" t="0" r="2540" b="0"/>
             <wp:docPr id="6" name="Picture 6"/>
             <wp:cNvGraphicFramePr>
               <a:graphicFrameLocks xmlns:a="http://schemas.openxmlformats.org/drawingml/2006/main" noChangeAspect="1"/>
@@ -3385,7 +4333,7 @@
                   <pic:spPr>
                     <a:xfrm>
                       <a:off x="0" y="0"/>
-                      <a:ext cx="3506656" cy="1401131"/>
+                      <a:ext cx="6039708" cy="2413245"/>
                     </a:xfrm>
                     <a:prstGeom prst="rect">
                       <a:avLst/>
@@ -3408,12 +4356,164 @@
       </w:r>
     </w:p>
     <w:p>
-      <w:r>
+      <w:pPr>
         <w:rPr>
           <w:b/>
           <w:color w:val="000000"/>
           <w:sz w:val="20"/>
-        </w:rPr>
+          <w:lang w:eastAsia="zh-CN"/>
+        </w:rPr>
+      </w:pPr>
+    </w:p>
+    <w:p>
+      <w:pPr>
+        <w:rPr>
+          <w:b/>
+          <w:color w:val="000000"/>
+          <w:sz w:val="20"/>
+          <w:lang w:eastAsia="zh-CN"/>
+        </w:rPr>
+      </w:pPr>
+    </w:p>
+    <w:p>
+      <w:pPr>
+        <w:rPr>
+          <w:b/>
+          <w:color w:val="000000"/>
+          <w:sz w:val="20"/>
+          <w:lang w:eastAsia="zh-CN"/>
+        </w:rPr>
+      </w:pPr>
+    </w:p>
+    <w:p>
+      <w:pPr>
+        <w:rPr>
+          <w:b/>
+          <w:color w:val="000000"/>
+          <w:sz w:val="20"/>
+          <w:lang w:eastAsia="zh-CN"/>
+        </w:rPr>
+      </w:pPr>
+    </w:p>
+    <w:p>
+      <w:pPr>
+        <w:rPr>
+          <w:b/>
+          <w:color w:val="000000"/>
+          <w:sz w:val="20"/>
+          <w:lang w:eastAsia="zh-CN"/>
+        </w:rPr>
+      </w:pPr>
+    </w:p>
+    <w:p>
+      <w:pPr>
+        <w:rPr>
+          <w:b/>
+          <w:color w:val="000000"/>
+          <w:sz w:val="20"/>
+          <w:lang w:eastAsia="zh-CN"/>
+        </w:rPr>
+      </w:pPr>
+    </w:p>
+    <w:p>
+      <w:pPr>
+        <w:rPr>
+          <w:b/>
+          <w:color w:val="000000"/>
+          <w:sz w:val="20"/>
+          <w:lang w:eastAsia="zh-CN"/>
+        </w:rPr>
+      </w:pPr>
+    </w:p>
+    <w:p>
+      <w:pPr>
+        <w:rPr>
+          <w:b/>
+          <w:color w:val="000000"/>
+          <w:sz w:val="20"/>
+          <w:lang w:eastAsia="zh-CN"/>
+        </w:rPr>
+      </w:pPr>
+    </w:p>
+    <w:p>
+      <w:pPr>
+        <w:rPr>
+          <w:b/>
+          <w:color w:val="000000"/>
+          <w:sz w:val="20"/>
+          <w:lang w:eastAsia="zh-CN"/>
+        </w:rPr>
+      </w:pPr>
+    </w:p>
+    <w:p>
+      <w:pPr>
+        <w:rPr>
+          <w:b/>
+          <w:color w:val="000000"/>
+          <w:sz w:val="20"/>
+          <w:lang w:eastAsia="zh-CN"/>
+        </w:rPr>
+      </w:pPr>
+    </w:p>
+    <w:p>
+      <w:pPr>
+        <w:rPr>
+          <w:b/>
+          <w:color w:val="000000"/>
+          <w:sz w:val="20"/>
+          <w:lang w:eastAsia="zh-CN"/>
+        </w:rPr>
+      </w:pPr>
+    </w:p>
+    <w:p>
+      <w:pPr>
+        <w:rPr>
+          <w:b/>
+          <w:color w:val="000000"/>
+          <w:sz w:val="20"/>
+          <w:lang w:eastAsia="zh-CN"/>
+        </w:rPr>
+      </w:pPr>
+    </w:p>
+    <w:p>
+      <w:pPr>
+        <w:rPr>
+          <w:b/>
+          <w:color w:val="000000"/>
+          <w:sz w:val="20"/>
+          <w:lang w:eastAsia="zh-CN"/>
+        </w:rPr>
+      </w:pPr>
+    </w:p>
+    <w:p>
+      <w:pPr>
+        <w:rPr>
+          <w:b/>
+          <w:color w:val="000000"/>
+          <w:sz w:val="20"/>
+          <w:lang w:eastAsia="zh-CN"/>
+        </w:rPr>
+      </w:pPr>
+    </w:p>
+    <w:p>
+      <w:pPr>
+        <w:rPr>
+          <w:rFonts w:hint="eastAsia"/>
+          <w:b/>
+          <w:color w:val="000000"/>
+          <w:sz w:val="20"/>
+          <w:lang w:eastAsia="zh-CN"/>
+        </w:rPr>
+      </w:pPr>
+    </w:p>
+    <w:p>
+      <w:r>
+        <w:rPr>
+          <w:b/>
+          <w:color w:val="000000"/>
+          <w:sz w:val="20"/>
+        </w:rPr>
+        <w:lastRenderedPageBreak/>
         <w:t>Q7. What is the average length of a surgical procedure, for surgeries where the patient had already presented with diabetes? Show the time in minutes.</w:t>
       </w:r>
     </w:p>
@@ -3811,9 +4911,9 @@
           <w:noProof/>
         </w:rPr>
         <w:drawing>
-          <wp:inline distT="0" distB="0" distL="114300" distR="114300" wp14:anchorId="295BEC96" wp14:editId="646EFA0B">
-            <wp:extent cx="3104350" cy="637501"/>
-            <wp:effectExtent l="0" t="0" r="0" b="0"/>
+          <wp:inline distT="0" distB="0" distL="114300" distR="114300" wp14:anchorId="295BEC96" wp14:editId="300CA3FD">
+            <wp:extent cx="5826445" cy="1196503"/>
+            <wp:effectExtent l="0" t="0" r="3175" b="0"/>
             <wp:docPr id="7" name="Picture 7"/>
             <wp:cNvGraphicFramePr>
               <a:graphicFrameLocks xmlns:a="http://schemas.openxmlformats.org/drawingml/2006/main" noChangeAspect="1"/>
@@ -3836,7 +4936,7 @@
                   <pic:spPr>
                     <a:xfrm>
                       <a:off x="0" y="0"/>
-                      <a:ext cx="3177189" cy="652459"/>
+                      <a:ext cx="6056115" cy="1243667"/>
                     </a:xfrm>
                     <a:prstGeom prst="rect">
                       <a:avLst/>
@@ -3859,12 +4959,215 @@
       </w:r>
     </w:p>
     <w:p>
-      <w:r>
+      <w:pPr>
         <w:rPr>
           <w:b/>
           <w:color w:val="000000"/>
           <w:sz w:val="20"/>
-        </w:rPr>
+          <w:lang w:eastAsia="zh-CN"/>
+        </w:rPr>
+      </w:pPr>
+    </w:p>
+    <w:p>
+      <w:pPr>
+        <w:rPr>
+          <w:b/>
+          <w:color w:val="000000"/>
+          <w:sz w:val="20"/>
+          <w:lang w:eastAsia="zh-CN"/>
+        </w:rPr>
+      </w:pPr>
+    </w:p>
+    <w:p>
+      <w:pPr>
+        <w:rPr>
+          <w:b/>
+          <w:color w:val="000000"/>
+          <w:sz w:val="20"/>
+          <w:lang w:eastAsia="zh-CN"/>
+        </w:rPr>
+      </w:pPr>
+    </w:p>
+    <w:p>
+      <w:pPr>
+        <w:rPr>
+          <w:b/>
+          <w:color w:val="000000"/>
+          <w:sz w:val="20"/>
+          <w:lang w:eastAsia="zh-CN"/>
+        </w:rPr>
+      </w:pPr>
+    </w:p>
+    <w:p>
+      <w:pPr>
+        <w:rPr>
+          <w:b/>
+          <w:color w:val="000000"/>
+          <w:sz w:val="20"/>
+          <w:lang w:eastAsia="zh-CN"/>
+        </w:rPr>
+      </w:pPr>
+    </w:p>
+    <w:p>
+      <w:pPr>
+        <w:rPr>
+          <w:b/>
+          <w:color w:val="000000"/>
+          <w:sz w:val="20"/>
+          <w:lang w:eastAsia="zh-CN"/>
+        </w:rPr>
+      </w:pPr>
+    </w:p>
+    <w:p>
+      <w:pPr>
+        <w:rPr>
+          <w:b/>
+          <w:color w:val="000000"/>
+          <w:sz w:val="20"/>
+          <w:lang w:eastAsia="zh-CN"/>
+        </w:rPr>
+      </w:pPr>
+    </w:p>
+    <w:p>
+      <w:pPr>
+        <w:rPr>
+          <w:b/>
+          <w:color w:val="000000"/>
+          <w:sz w:val="20"/>
+          <w:lang w:eastAsia="zh-CN"/>
+        </w:rPr>
+      </w:pPr>
+    </w:p>
+    <w:p>
+      <w:pPr>
+        <w:rPr>
+          <w:b/>
+          <w:color w:val="000000"/>
+          <w:sz w:val="20"/>
+          <w:lang w:eastAsia="zh-CN"/>
+        </w:rPr>
+      </w:pPr>
+    </w:p>
+    <w:p>
+      <w:pPr>
+        <w:rPr>
+          <w:b/>
+          <w:color w:val="000000"/>
+          <w:sz w:val="20"/>
+          <w:lang w:eastAsia="zh-CN"/>
+        </w:rPr>
+      </w:pPr>
+    </w:p>
+    <w:p>
+      <w:pPr>
+        <w:rPr>
+          <w:b/>
+          <w:color w:val="000000"/>
+          <w:sz w:val="20"/>
+          <w:lang w:eastAsia="zh-CN"/>
+        </w:rPr>
+      </w:pPr>
+    </w:p>
+    <w:p>
+      <w:pPr>
+        <w:rPr>
+          <w:b/>
+          <w:color w:val="000000"/>
+          <w:sz w:val="20"/>
+          <w:lang w:eastAsia="zh-CN"/>
+        </w:rPr>
+      </w:pPr>
+    </w:p>
+    <w:p>
+      <w:pPr>
+        <w:rPr>
+          <w:b/>
+          <w:color w:val="000000"/>
+          <w:sz w:val="20"/>
+          <w:lang w:eastAsia="zh-CN"/>
+        </w:rPr>
+      </w:pPr>
+    </w:p>
+    <w:p>
+      <w:pPr>
+        <w:rPr>
+          <w:b/>
+          <w:color w:val="000000"/>
+          <w:sz w:val="20"/>
+          <w:lang w:eastAsia="zh-CN"/>
+        </w:rPr>
+      </w:pPr>
+    </w:p>
+    <w:p>
+      <w:pPr>
+        <w:rPr>
+          <w:b/>
+          <w:color w:val="000000"/>
+          <w:sz w:val="20"/>
+          <w:lang w:eastAsia="zh-CN"/>
+        </w:rPr>
+      </w:pPr>
+    </w:p>
+    <w:p>
+      <w:pPr>
+        <w:rPr>
+          <w:b/>
+          <w:color w:val="000000"/>
+          <w:sz w:val="20"/>
+          <w:lang w:eastAsia="zh-CN"/>
+        </w:rPr>
+      </w:pPr>
+    </w:p>
+    <w:p>
+      <w:pPr>
+        <w:rPr>
+          <w:b/>
+          <w:color w:val="000000"/>
+          <w:sz w:val="20"/>
+          <w:lang w:eastAsia="zh-CN"/>
+        </w:rPr>
+      </w:pPr>
+    </w:p>
+    <w:p>
+      <w:pPr>
+        <w:rPr>
+          <w:b/>
+          <w:color w:val="000000"/>
+          <w:sz w:val="20"/>
+          <w:lang w:eastAsia="zh-CN"/>
+        </w:rPr>
+      </w:pPr>
+    </w:p>
+    <w:p>
+      <w:pPr>
+        <w:rPr>
+          <w:rFonts w:hint="eastAsia"/>
+          <w:b/>
+          <w:color w:val="000000"/>
+          <w:sz w:val="20"/>
+          <w:lang w:eastAsia="zh-CN"/>
+        </w:rPr>
+      </w:pPr>
+    </w:p>
+    <w:p>
+      <w:pPr>
+        <w:rPr>
+          <w:rFonts w:hint="eastAsia"/>
+          <w:b/>
+          <w:color w:val="000000"/>
+          <w:sz w:val="20"/>
+          <w:lang w:eastAsia="zh-CN"/>
+        </w:rPr>
+      </w:pPr>
+    </w:p>
+    <w:p>
+      <w:r>
+        <w:rPr>
+          <w:b/>
+          <w:color w:val="000000"/>
+          <w:sz w:val="20"/>
+        </w:rPr>
+        <w:lastRenderedPageBreak/>
         <w:t>Q8. List surgeries where any two of doctor, nurse or helper had the same last name. Show surgeon ID and the doctor's, nurse's and helper's full names; order by doctor's name.</w:t>
       </w:r>
     </w:p>
@@ -5579,19 +6882,236 @@
       </w:r>
     </w:p>
     <w:p>
-      <w:r>
+      <w:pPr>
         <w:rPr>
           <w:b/>
           <w:color w:val="FF0000"/>
+          <w:lang w:eastAsia="zh-CN"/>
+        </w:rPr>
+      </w:pPr>
+      <w:r>
+        <w:rPr>
+          <w:b/>
+          <w:color w:val="FF0000"/>
         </w:rPr>
         <w:t xml:space="preserve">4 rows returned </w:t>
       </w:r>
+    </w:p>
+    <w:p>
+      <w:pPr>
+        <w:rPr>
+          <w:b/>
+          <w:color w:val="FF0000"/>
+          <w:lang w:eastAsia="zh-CN"/>
+        </w:rPr>
+      </w:pPr>
+    </w:p>
+    <w:p>
+      <w:pPr>
+        <w:rPr>
+          <w:b/>
+          <w:color w:val="FF0000"/>
+          <w:lang w:eastAsia="zh-CN"/>
+        </w:rPr>
+      </w:pPr>
+    </w:p>
+    <w:p>
+      <w:pPr>
+        <w:rPr>
+          <w:b/>
+          <w:color w:val="FF0000"/>
+          <w:lang w:eastAsia="zh-CN"/>
+        </w:rPr>
+      </w:pPr>
+    </w:p>
+    <w:p>
+      <w:pPr>
+        <w:rPr>
+          <w:b/>
+          <w:color w:val="FF0000"/>
+          <w:lang w:eastAsia="zh-CN"/>
+        </w:rPr>
+      </w:pPr>
+    </w:p>
+    <w:p>
+      <w:pPr>
+        <w:rPr>
+          <w:b/>
+          <w:color w:val="FF0000"/>
+          <w:lang w:eastAsia="zh-CN"/>
+        </w:rPr>
+      </w:pPr>
+    </w:p>
+    <w:p>
+      <w:pPr>
+        <w:rPr>
+          <w:b/>
+          <w:color w:val="FF0000"/>
+          <w:lang w:eastAsia="zh-CN"/>
+        </w:rPr>
+      </w:pPr>
+    </w:p>
+    <w:p>
+      <w:pPr>
+        <w:rPr>
+          <w:b/>
+          <w:color w:val="FF0000"/>
+          <w:lang w:eastAsia="zh-CN"/>
+        </w:rPr>
+      </w:pPr>
+    </w:p>
+    <w:p>
+      <w:pPr>
+        <w:rPr>
+          <w:b/>
+          <w:color w:val="FF0000"/>
+          <w:lang w:eastAsia="zh-CN"/>
+        </w:rPr>
+      </w:pPr>
+    </w:p>
+    <w:p>
+      <w:pPr>
+        <w:rPr>
+          <w:b/>
+          <w:color w:val="FF0000"/>
+          <w:lang w:eastAsia="zh-CN"/>
+        </w:rPr>
+      </w:pPr>
+    </w:p>
+    <w:p>
+      <w:pPr>
+        <w:rPr>
+          <w:b/>
+          <w:color w:val="FF0000"/>
+          <w:lang w:eastAsia="zh-CN"/>
+        </w:rPr>
+      </w:pPr>
+    </w:p>
+    <w:p>
+      <w:pPr>
+        <w:rPr>
+          <w:b/>
+          <w:color w:val="FF0000"/>
+          <w:lang w:eastAsia="zh-CN"/>
+        </w:rPr>
+      </w:pPr>
+    </w:p>
+    <w:p>
+      <w:pPr>
+        <w:rPr>
+          <w:b/>
+          <w:color w:val="FF0000"/>
+          <w:lang w:eastAsia="zh-CN"/>
+        </w:rPr>
+      </w:pPr>
+    </w:p>
+    <w:p>
+      <w:pPr>
+        <w:rPr>
+          <w:b/>
+          <w:color w:val="FF0000"/>
+          <w:lang w:eastAsia="zh-CN"/>
+        </w:rPr>
+      </w:pPr>
+    </w:p>
+    <w:p>
+      <w:pPr>
+        <w:rPr>
+          <w:b/>
+          <w:color w:val="FF0000"/>
+          <w:lang w:eastAsia="zh-CN"/>
+        </w:rPr>
+      </w:pPr>
+    </w:p>
+    <w:p>
+      <w:pPr>
+        <w:rPr>
+          <w:b/>
+          <w:color w:val="FF0000"/>
+          <w:lang w:eastAsia="zh-CN"/>
+        </w:rPr>
+      </w:pPr>
+    </w:p>
+    <w:p>
+      <w:pPr>
+        <w:rPr>
+          <w:b/>
+          <w:color w:val="FF0000"/>
+          <w:lang w:eastAsia="zh-CN"/>
+        </w:rPr>
+      </w:pPr>
+    </w:p>
+    <w:p>
+      <w:pPr>
+        <w:rPr>
+          <w:b/>
+          <w:color w:val="FF0000"/>
+          <w:lang w:eastAsia="zh-CN"/>
+        </w:rPr>
+      </w:pPr>
+    </w:p>
+    <w:p>
+      <w:pPr>
+        <w:rPr>
+          <w:b/>
+          <w:color w:val="FF0000"/>
+          <w:lang w:eastAsia="zh-CN"/>
+        </w:rPr>
+      </w:pPr>
+    </w:p>
+    <w:p>
+      <w:pPr>
+        <w:rPr>
+          <w:b/>
+          <w:color w:val="FF0000"/>
+          <w:lang w:eastAsia="zh-CN"/>
+        </w:rPr>
+      </w:pPr>
+    </w:p>
+    <w:p>
+      <w:pPr>
+        <w:rPr>
+          <w:b/>
+          <w:color w:val="FF0000"/>
+          <w:lang w:eastAsia="zh-CN"/>
+        </w:rPr>
+      </w:pPr>
+    </w:p>
+    <w:p>
+      <w:pPr>
+        <w:rPr>
+          <w:b/>
+          <w:color w:val="FF0000"/>
+          <w:lang w:eastAsia="zh-CN"/>
+        </w:rPr>
+      </w:pPr>
+    </w:p>
+    <w:p>
+      <w:pPr>
+        <w:rPr>
+          <w:b/>
+          <w:color w:val="FF0000"/>
+          <w:lang w:eastAsia="zh-CN"/>
+        </w:rPr>
+      </w:pPr>
+    </w:p>
+    <w:p>
+      <w:pPr>
+        <w:rPr>
+          <w:b/>
+          <w:color w:val="FF0000"/>
+          <w:lang w:eastAsia="zh-CN"/>
+        </w:rPr>
+      </w:pPr>
+    </w:p>
+    <w:p>
       <w:r>
         <w:rPr>
           <w:b/>
           <w:color w:val="000000"/>
           <w:sz w:val="20"/>
         </w:rPr>
+        <w:lastRenderedPageBreak/>
         <w:t>Q10b. Set capacity of all standard rooms to 4. Check that all standard rooms got updated by running a SELECT statement with student ID.</w:t>
       </w:r>
     </w:p>
@@ -6515,13 +8035,124 @@
     <w:p>
       <w:pPr>
         <w:spacing w:after="80"/>
-      </w:pPr>
-      <w:r>
         <w:rPr>
           <w:b/>
           <w:color w:val="000000"/>
           <w:sz w:val="20"/>
-        </w:rPr>
+          <w:lang w:eastAsia="zh-CN"/>
+        </w:rPr>
+      </w:pPr>
+    </w:p>
+    <w:p>
+      <w:pPr>
+        <w:spacing w:after="80"/>
+        <w:rPr>
+          <w:b/>
+          <w:color w:val="000000"/>
+          <w:sz w:val="20"/>
+          <w:lang w:eastAsia="zh-CN"/>
+        </w:rPr>
+      </w:pPr>
+    </w:p>
+    <w:p>
+      <w:pPr>
+        <w:spacing w:after="80"/>
+        <w:rPr>
+          <w:b/>
+          <w:color w:val="000000"/>
+          <w:sz w:val="20"/>
+          <w:lang w:eastAsia="zh-CN"/>
+        </w:rPr>
+      </w:pPr>
+    </w:p>
+    <w:p>
+      <w:pPr>
+        <w:spacing w:after="80"/>
+        <w:rPr>
+          <w:b/>
+          <w:color w:val="000000"/>
+          <w:sz w:val="20"/>
+          <w:lang w:eastAsia="zh-CN"/>
+        </w:rPr>
+      </w:pPr>
+    </w:p>
+    <w:p>
+      <w:pPr>
+        <w:spacing w:after="80"/>
+        <w:rPr>
+          <w:b/>
+          <w:color w:val="000000"/>
+          <w:sz w:val="20"/>
+          <w:lang w:eastAsia="zh-CN"/>
+        </w:rPr>
+      </w:pPr>
+    </w:p>
+    <w:p>
+      <w:pPr>
+        <w:spacing w:after="80"/>
+        <w:rPr>
+          <w:b/>
+          <w:color w:val="000000"/>
+          <w:sz w:val="20"/>
+          <w:lang w:eastAsia="zh-CN"/>
+        </w:rPr>
+      </w:pPr>
+    </w:p>
+    <w:p>
+      <w:pPr>
+        <w:spacing w:after="80"/>
+        <w:rPr>
+          <w:b/>
+          <w:color w:val="000000"/>
+          <w:sz w:val="20"/>
+          <w:lang w:eastAsia="zh-CN"/>
+        </w:rPr>
+      </w:pPr>
+    </w:p>
+    <w:p>
+      <w:pPr>
+        <w:spacing w:after="80"/>
+        <w:rPr>
+          <w:b/>
+          <w:color w:val="000000"/>
+          <w:sz w:val="20"/>
+          <w:lang w:eastAsia="zh-CN"/>
+        </w:rPr>
+      </w:pPr>
+    </w:p>
+    <w:p>
+      <w:pPr>
+        <w:spacing w:after="80"/>
+        <w:rPr>
+          <w:b/>
+          <w:color w:val="000000"/>
+          <w:sz w:val="20"/>
+          <w:lang w:eastAsia="zh-CN"/>
+        </w:rPr>
+      </w:pPr>
+    </w:p>
+    <w:p>
+      <w:pPr>
+        <w:spacing w:after="80"/>
+        <w:rPr>
+          <w:b/>
+          <w:color w:val="000000"/>
+          <w:sz w:val="20"/>
+          <w:lang w:eastAsia="zh-CN"/>
+        </w:rPr>
+      </w:pPr>
+    </w:p>
+    <w:p>
+      <w:pPr>
+        <w:spacing w:after="80"/>
+      </w:pPr>
+      <w:r>
+        <w:rPr>
+          <w:b/>
+          <w:color w:val="000000"/>
+          <w:sz w:val="20"/>
+        </w:rPr>
+        <w:lastRenderedPageBreak/>
         <w:t>Q11b. Using the view created in Q11a, list the surgeons who completed the highest number of surgeries. Display surgeon ID, full name and number of surgeries, with student ID.</w:t>
       </w:r>
     </w:p>

</xml_diff>